<commit_message>
ubah lebar kolom kelas
</commit_message>
<xml_diff>
--- a/FORM.docx
+++ b/FORM.docx
@@ -303,9 +303,9 @@
         <w:tblLook w:val="01E0" w:firstRow="1" w:lastRow="1" w:firstColumn="1" w:lastColumn="1" w:noHBand="0" w:noVBand="0"/>
       </w:tblPr>
       <w:tblGrid>
-        <w:gridCol w:w="1685"/>
-        <w:gridCol w:w="5067"/>
-        <w:gridCol w:w="1774"/>
+        <w:gridCol w:w="1695"/>
+        <w:gridCol w:w="5140"/>
+        <w:gridCol w:w="1691"/>
         <w:gridCol w:w="709"/>
         <w:gridCol w:w="6262"/>
       </w:tblGrid>
@@ -315,7 +315,7 @@
         </w:trPr>
         <w:tc>
           <w:tcPr>
-            <w:tcW w:w="1685" w:type="dxa"/>
+            <w:tcW w:w="1695" w:type="dxa"/>
             <w:tcBorders>
               <w:top w:val="single" w:sz="12" w:space="0" w:color="auto"/>
               <w:left w:val="single" w:sz="12" w:space="0" w:color="auto"/>
@@ -363,7 +363,7 @@
         </w:tc>
         <w:tc>
           <w:tcPr>
-            <w:tcW w:w="5067" w:type="dxa"/>
+            <w:tcW w:w="5140" w:type="dxa"/>
             <w:tcBorders>
               <w:top w:val="single" w:sz="12" w:space="0" w:color="auto"/>
               <w:bottom w:val="double" w:sz="6" w:space="0" w:color="auto"/>
@@ -410,7 +410,7 @@
         </w:tc>
         <w:tc>
           <w:tcPr>
-            <w:tcW w:w="1774" w:type="dxa"/>
+            <w:tcW w:w="1691" w:type="dxa"/>
             <w:tcBorders>
               <w:top w:val="single" w:sz="12" w:space="0" w:color="auto"/>
               <w:bottom w:val="double" w:sz="6" w:space="0" w:color="auto"/>
@@ -543,9 +543,9 @@
         <w:gridCol w:w="1247"/>
         <w:gridCol w:w="1553"/>
         <w:gridCol w:w="2743"/>
-        <w:gridCol w:w="766"/>
-        <w:gridCol w:w="1782"/>
-        <w:gridCol w:w="1767"/>
+        <w:gridCol w:w="844"/>
+        <w:gridCol w:w="1701"/>
+        <w:gridCol w:w="1770"/>
         <w:gridCol w:w="398"/>
         <w:gridCol w:w="398"/>
         <w:gridCol w:w="398"/>
@@ -683,7 +683,7 @@
         </w:tc>
         <w:tc>
           <w:tcPr>
-            <w:tcW w:w="766" w:type="dxa"/>
+            <w:tcW w:w="844" w:type="dxa"/>
             <w:vMerge w:val="restart"/>
             <w:tcBorders>
               <w:top w:val="single" w:sz="12" w:space="0" w:color="auto"/>
@@ -712,7 +712,7 @@
         </w:tc>
         <w:tc>
           <w:tcPr>
-            <w:tcW w:w="1782" w:type="dxa"/>
+            <w:tcW w:w="1701" w:type="dxa"/>
             <w:vMerge w:val="restart"/>
             <w:tcBorders>
               <w:top w:val="single" w:sz="12" w:space="0" w:color="auto"/>
@@ -741,7 +741,7 @@
         </w:tc>
         <w:tc>
           <w:tcPr>
-            <w:tcW w:w="1767" w:type="dxa"/>
+            <w:tcW w:w="1770" w:type="dxa"/>
             <w:vMerge w:val="restart"/>
             <w:tcBorders>
               <w:top w:val="single" w:sz="12" w:space="0" w:color="auto"/>
@@ -837,7 +837,7 @@
         </w:tc>
         <w:tc>
           <w:tcPr>
-            <w:tcW w:w="1735" w:type="dxa"/>
+            <w:tcW w:w="1736" w:type="dxa"/>
             <w:gridSpan w:val="4"/>
             <w:tcBorders>
               <w:top w:val="single" w:sz="12" w:space="0" w:color="auto"/>
@@ -953,7 +953,7 @@
         </w:tc>
         <w:tc>
           <w:tcPr>
-            <w:tcW w:w="766" w:type="dxa"/>
+            <w:tcW w:w="844" w:type="dxa"/>
             <w:vMerge/>
             <w:tcBorders>
               <w:bottom w:val="double" w:sz="6" w:space="0" w:color="auto"/>
@@ -972,7 +972,7 @@
         </w:tc>
         <w:tc>
           <w:tcPr>
-            <w:tcW w:w="1782" w:type="dxa"/>
+            <w:tcW w:w="1701" w:type="dxa"/>
             <w:vMerge/>
             <w:tcBorders>
               <w:bottom w:val="double" w:sz="6" w:space="0" w:color="auto"/>
@@ -991,7 +991,7 @@
         </w:tc>
         <w:tc>
           <w:tcPr>
-            <w:tcW w:w="1767" w:type="dxa"/>
+            <w:tcW w:w="1770" w:type="dxa"/>
             <w:vMerge/>
             <w:tcBorders>
               <w:bottom w:val="double" w:sz="6" w:space="0" w:color="auto"/>
@@ -1513,7 +1513,7 @@
         </w:tc>
         <w:tc>
           <w:tcPr>
-            <w:tcW w:w="766" w:type="dxa"/>
+            <w:tcW w:w="844" w:type="dxa"/>
             <w:tcBorders>
               <w:top w:val="double" w:sz="6" w:space="0" w:color="auto"/>
             </w:tcBorders>
@@ -1535,6 +1535,12 @@
             </w:r>
             <w:r>
               <w:rPr>
+                <w:sz w:val="15"/>
+              </w:rPr>
+              <w:t>1</w:t>
+            </w:r>
+            <w:r>
+              <w:rPr>
                 <w:spacing w:val="-10"/>
                 <w:sz w:val="15"/>
               </w:rPr>
@@ -1544,7 +1550,7 @@
         </w:tc>
         <w:tc>
           <w:tcPr>
-            <w:tcW w:w="1782" w:type="dxa"/>
+            <w:tcW w:w="1701" w:type="dxa"/>
             <w:tcBorders>
               <w:top w:val="double" w:sz="6" w:space="0" w:color="auto"/>
             </w:tcBorders>
@@ -1576,7 +1582,7 @@
         </w:tc>
         <w:tc>
           <w:tcPr>
-            <w:tcW w:w="1767" w:type="dxa"/>
+            <w:tcW w:w="1770" w:type="dxa"/>
             <w:tcBorders>
               <w:top w:val="double" w:sz="6" w:space="0" w:color="auto"/>
               <w:right w:val="single" w:sz="12" w:space="0" w:color="auto"/>
@@ -1587,7 +1593,6 @@
             <w:pPr>
               <w:pStyle w:val="TableParagraph"/>
               <w:ind w:left="81"/>
-              <w:jc w:val="center"/>
               <w:rPr>
                 <w:sz w:val="15"/>
               </w:rPr>
@@ -1957,7 +1962,7 @@
         </w:tc>
         <w:tc>
           <w:tcPr>
-            <w:tcW w:w="766" w:type="dxa"/>
+            <w:tcW w:w="844" w:type="dxa"/>
             <w:vAlign w:val="center"/>
           </w:tcPr>
           <w:p>
@@ -1985,7 +1990,7 @@
         </w:tc>
         <w:tc>
           <w:tcPr>
-            <w:tcW w:w="1782" w:type="dxa"/>
+            <w:tcW w:w="1701" w:type="dxa"/>
             <w:vAlign w:val="center"/>
           </w:tcPr>
           <w:p>
@@ -2007,7 +2012,7 @@
         </w:tc>
         <w:tc>
           <w:tcPr>
-            <w:tcW w:w="1767" w:type="dxa"/>
+            <w:tcW w:w="1770" w:type="dxa"/>
             <w:tcBorders>
               <w:right w:val="single" w:sz="12" w:space="0" w:color="auto"/>
             </w:tcBorders>
@@ -2017,7 +2022,6 @@
             <w:pPr>
               <w:pStyle w:val="TableParagraph"/>
               <w:ind w:left="81"/>
-              <w:jc w:val="center"/>
               <w:rPr>
                 <w:sz w:val="15"/>
               </w:rPr>
@@ -2387,7 +2391,7 @@
         </w:tc>
         <w:tc>
           <w:tcPr>
-            <w:tcW w:w="766" w:type="dxa"/>
+            <w:tcW w:w="844" w:type="dxa"/>
             <w:vAlign w:val="center"/>
           </w:tcPr>
           <w:p>
@@ -2415,7 +2419,7 @@
         </w:tc>
         <w:tc>
           <w:tcPr>
-            <w:tcW w:w="1782" w:type="dxa"/>
+            <w:tcW w:w="1701" w:type="dxa"/>
             <w:vAlign w:val="center"/>
           </w:tcPr>
           <w:p>
@@ -2443,7 +2447,7 @@
         </w:tc>
         <w:tc>
           <w:tcPr>
-            <w:tcW w:w="1767" w:type="dxa"/>
+            <w:tcW w:w="1770" w:type="dxa"/>
             <w:tcBorders>
               <w:right w:val="single" w:sz="12" w:space="0" w:color="auto"/>
             </w:tcBorders>
@@ -2453,7 +2457,6 @@
             <w:pPr>
               <w:pStyle w:val="TableParagraph"/>
               <w:ind w:left="81"/>
-              <w:jc w:val="center"/>
               <w:rPr>
                 <w:sz w:val="15"/>
               </w:rPr>
@@ -2823,7 +2826,7 @@
         </w:tc>
         <w:tc>
           <w:tcPr>
-            <w:tcW w:w="766" w:type="dxa"/>
+            <w:tcW w:w="844" w:type="dxa"/>
             <w:vAlign w:val="center"/>
           </w:tcPr>
           <w:p>
@@ -2851,7 +2854,7 @@
         </w:tc>
         <w:tc>
           <w:tcPr>
-            <w:tcW w:w="1782" w:type="dxa"/>
+            <w:tcW w:w="1701" w:type="dxa"/>
             <w:vAlign w:val="center"/>
           </w:tcPr>
           <w:p>
@@ -2873,7 +2876,7 @@
         </w:tc>
         <w:tc>
           <w:tcPr>
-            <w:tcW w:w="1767" w:type="dxa"/>
+            <w:tcW w:w="1770" w:type="dxa"/>
             <w:tcBorders>
               <w:right w:val="single" w:sz="12" w:space="0" w:color="auto"/>
             </w:tcBorders>
@@ -2883,7 +2886,6 @@
             <w:pPr>
               <w:pStyle w:val="TableParagraph"/>
               <w:ind w:left="81"/>
-              <w:jc w:val="center"/>
               <w:rPr>
                 <w:sz w:val="15"/>
               </w:rPr>
@@ -3253,7 +3255,7 @@
         </w:tc>
         <w:tc>
           <w:tcPr>
-            <w:tcW w:w="766" w:type="dxa"/>
+            <w:tcW w:w="844" w:type="dxa"/>
             <w:vAlign w:val="center"/>
           </w:tcPr>
           <w:p>
@@ -3281,7 +3283,7 @@
         </w:tc>
         <w:tc>
           <w:tcPr>
-            <w:tcW w:w="1782" w:type="dxa"/>
+            <w:tcW w:w="1701" w:type="dxa"/>
             <w:vAlign w:val="center"/>
           </w:tcPr>
           <w:p>
@@ -3303,7 +3305,7 @@
         </w:tc>
         <w:tc>
           <w:tcPr>
-            <w:tcW w:w="1767" w:type="dxa"/>
+            <w:tcW w:w="1770" w:type="dxa"/>
             <w:tcBorders>
               <w:right w:val="single" w:sz="12" w:space="0" w:color="auto"/>
             </w:tcBorders>
@@ -3313,7 +3315,6 @@
             <w:pPr>
               <w:pStyle w:val="TableParagraph"/>
               <w:ind w:left="81"/>
-              <w:jc w:val="center"/>
               <w:rPr>
                 <w:sz w:val="15"/>
               </w:rPr>
@@ -3683,7 +3684,7 @@
         </w:tc>
         <w:tc>
           <w:tcPr>
-            <w:tcW w:w="766" w:type="dxa"/>
+            <w:tcW w:w="844" w:type="dxa"/>
             <w:vAlign w:val="center"/>
           </w:tcPr>
           <w:p>
@@ -3711,7 +3712,7 @@
         </w:tc>
         <w:tc>
           <w:tcPr>
-            <w:tcW w:w="1782" w:type="dxa"/>
+            <w:tcW w:w="1701" w:type="dxa"/>
             <w:vAlign w:val="center"/>
           </w:tcPr>
           <w:p>
@@ -3733,7 +3734,7 @@
         </w:tc>
         <w:tc>
           <w:tcPr>
-            <w:tcW w:w="1767" w:type="dxa"/>
+            <w:tcW w:w="1770" w:type="dxa"/>
             <w:tcBorders>
               <w:right w:val="single" w:sz="12" w:space="0" w:color="auto"/>
             </w:tcBorders>
@@ -3743,7 +3744,6 @@
             <w:pPr>
               <w:pStyle w:val="TableParagraph"/>
               <w:ind w:left="81"/>
-              <w:jc w:val="center"/>
               <w:rPr>
                 <w:sz w:val="15"/>
               </w:rPr>
@@ -4123,7 +4123,7 @@
         </w:tc>
         <w:tc>
           <w:tcPr>
-            <w:tcW w:w="766" w:type="dxa"/>
+            <w:tcW w:w="844" w:type="dxa"/>
             <w:tcBorders>
               <w:bottom w:val="single" w:sz="12" w:space="0" w:color="auto"/>
             </w:tcBorders>
@@ -4154,7 +4154,7 @@
         </w:tc>
         <w:tc>
           <w:tcPr>
-            <w:tcW w:w="1782" w:type="dxa"/>
+            <w:tcW w:w="1701" w:type="dxa"/>
             <w:tcBorders>
               <w:bottom w:val="single" w:sz="12" w:space="0" w:color="auto"/>
             </w:tcBorders>
@@ -4179,7 +4179,7 @@
         </w:tc>
         <w:tc>
           <w:tcPr>
-            <w:tcW w:w="1767" w:type="dxa"/>
+            <w:tcW w:w="1770" w:type="dxa"/>
             <w:tcBorders>
               <w:bottom w:val="single" w:sz="12" w:space="0" w:color="auto"/>
               <w:right w:val="single" w:sz="12" w:space="0" w:color="auto"/>
@@ -4190,7 +4190,6 @@
             <w:pPr>
               <w:pStyle w:val="TableParagraph"/>
               <w:ind w:left="81"/>
-              <w:jc w:val="center"/>
               <w:rPr>
                 <w:sz w:val="15"/>
               </w:rPr>
@@ -5226,7 +5225,7 @@
         </mc:Choice>
         <mc:Fallback>
           <w:pict>
-            <v:shape w14:anchorId="333BF3A0" id="Graphic 1" o:spid="_x0000_s1026" style="position:absolute;margin-left:34pt;margin-top:555.6pt;width:773.9pt;height:.1pt;z-index:-251659264;visibility:visible;mso-wrap-style:square;mso-wrap-distance-left:0;mso-wrap-distance-top:0;mso-wrap-distance-right:0;mso-wrap-distance-bottom:0;mso-position-horizontal:absolute;mso-position-horizontal-relative:page;mso-position-vertical:absolute;mso-position-vertical-relative:page;v-text-anchor:top" coordsize="9828530,1270" o:gfxdata="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" path="m,l9827999,e" filled="f" strokecolor="black [3040]">
+            <v:shape w14:anchorId="1808E23F" id="Graphic 1" o:spid="_x0000_s1026" style="position:absolute;margin-left:34pt;margin-top:555.6pt;width:773.9pt;height:.1pt;z-index:-251659264;visibility:visible;mso-wrap-style:square;mso-wrap-distance-left:0;mso-wrap-distance-top:0;mso-wrap-distance-right:0;mso-wrap-distance-bottom:0;mso-position-horizontal:absolute;mso-position-horizontal-relative:page;mso-position-vertical:absolute;mso-position-vertical-relative:page;v-text-anchor:top" coordsize="9828530,1270" o:gfxdata="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" path="m,l9827999,e" filled="f" strokecolor="black [3040]">
               <v:path arrowok="t"/>
               <w10:wrap anchorx="page" anchory="page"/>
             </v:shape>

</xml_diff>